<commit_message>
Initial EWMT full system upload
</commit_message>
<xml_diff>
--- a/Templates/Lifting Plan Template.docx
+++ b/Templates/Lifting Plan Template.docx
@@ -217,12 +217,12 @@
         <w:gridCol w:w="1023"/>
         <w:gridCol w:w="534"/>
         <w:gridCol w:w="422"/>
-        <w:gridCol w:w="1312"/>
-        <w:gridCol w:w="141"/>
-        <w:gridCol w:w="142"/>
-        <w:gridCol w:w="1134"/>
-        <w:gridCol w:w="567"/>
-        <w:gridCol w:w="255"/>
+        <w:gridCol w:w="899"/>
+        <w:gridCol w:w="238"/>
+        <w:gridCol w:w="41"/>
+        <w:gridCol w:w="1551"/>
+        <w:gridCol w:w="251"/>
+        <w:gridCol w:w="571"/>
         <w:gridCol w:w="78"/>
         <w:gridCol w:w="256"/>
         <w:gridCol w:w="2359"/>
@@ -282,37 +282,10 @@
             <w:gridSpan w:val="11"/>
           </w:tcPr>
           <w:p>
-            <w:r>
-              <w:rPr>
-                <w:sz w:val="24"/>
-                <w:szCs w:val="24"/>
-              </w:rPr>
-              <w:t>{{</w:t>
-            </w:r>
-            <w:proofErr w:type="spellStart"/>
-            <w:r>
-              <w:rPr>
-                <w:sz w:val="24"/>
-                <w:szCs w:val="24"/>
-              </w:rPr>
-              <w:t>project_name</w:t>
-            </w:r>
-            <w:proofErr w:type="spellEnd"/>
-            <w:proofErr w:type="gramStart"/>
-            <w:r>
-              <w:rPr>
-                <w:sz w:val="24"/>
-                <w:szCs w:val="24"/>
-              </w:rPr>
-              <w:t>}}</w:t>
-            </w:r>
-            <w:r>
-              <w:t xml:space="preserve">   </w:t>
-            </w:r>
-            <w:proofErr w:type="gramEnd"/>
-            <w:r>
-              <w:tab/>
-            </w:r>
+            <w:pPr>
+              <w:pStyle w:val="ListParagraph"/>
+              <w:ind w:left="0"/>
+            </w:pPr>
           </w:p>
         </w:tc>
       </w:tr>
@@ -343,27 +316,10 @@
             <w:gridSpan w:val="11"/>
           </w:tcPr>
           <w:p>
-            <w:r>
-              <w:rPr>
-                <w:sz w:val="24"/>
-                <w:szCs w:val="24"/>
-              </w:rPr>
-              <w:t>{{</w:t>
-            </w:r>
-            <w:r>
-              <w:rPr>
-                <w:sz w:val="24"/>
-                <w:szCs w:val="24"/>
-              </w:rPr>
-              <w:t>location</w:t>
-            </w:r>
-            <w:r>
-              <w:rPr>
-                <w:sz w:val="24"/>
-                <w:szCs w:val="24"/>
-              </w:rPr>
-              <w:t>}}</w:t>
-            </w:r>
+            <w:pPr>
+              <w:pStyle w:val="ListParagraph"/>
+              <w:ind w:left="0"/>
+            </w:pPr>
           </w:p>
         </w:tc>
       </w:tr>
@@ -401,67 +357,9 @@
           </w:tcPr>
           <w:p>
             <w:pPr>
-              <w:pStyle w:val="Header"/>
-              <w:rPr>
-                <w:sz w:val="24"/>
-                <w:lang w:eastAsia="zh-CN"/>
-              </w:rPr>
-            </w:pPr>
-            <w:r>
-              <w:rPr>
-                <w:sz w:val="24"/>
-                <w:lang w:eastAsia="zh-CN"/>
-              </w:rPr>
-              <w:t>{{</w:t>
-            </w:r>
-            <w:proofErr w:type="spellStart"/>
-            <w:r>
-              <w:rPr>
-                <w:sz w:val="24"/>
-                <w:lang w:eastAsia="zh-CN"/>
-              </w:rPr>
-              <w:t>operation_date</w:t>
-            </w:r>
-            <w:proofErr w:type="spellEnd"/>
-            <w:r>
-              <w:rPr>
-                <w:sz w:val="24"/>
-                <w:lang w:eastAsia="zh-CN"/>
-              </w:rPr>
-              <w:t>}}</w:t>
-            </w:r>
-          </w:p>
-          <w:p>
-            <w:pPr>
-              <w:pStyle w:val="Header"/>
-              <w:rPr>
-                <w:sz w:val="24"/>
-                <w:lang w:eastAsia="zh-CN"/>
-              </w:rPr>
-            </w:pPr>
-            <w:r>
-              <w:rPr>
-                <w:sz w:val="24"/>
-                <w:lang w:eastAsia="zh-CN"/>
-              </w:rPr>
-              <w:t>{{</w:t>
-            </w:r>
-            <w:proofErr w:type="spellStart"/>
-            <w:r>
-              <w:rPr>
-                <w:sz w:val="24"/>
-                <w:lang w:eastAsia="zh-CN"/>
-              </w:rPr>
-              <w:t>operation_time</w:t>
-            </w:r>
-            <w:proofErr w:type="spellEnd"/>
-            <w:r>
-              <w:rPr>
-                <w:sz w:val="24"/>
-                <w:lang w:eastAsia="zh-CN"/>
-              </w:rPr>
-              <w:t>}}</w:t>
-            </w:r>
+              <w:pStyle w:val="ListParagraph"/>
+              <w:ind w:left="0"/>
+            </w:pPr>
           </w:p>
         </w:tc>
       </w:tr>
@@ -502,9 +400,6 @@
               <w:pStyle w:val="ListParagraph"/>
               <w:ind w:left="0"/>
             </w:pPr>
-            <w:r>
-              <w:t>1 Day</w:t>
-            </w:r>
           </w:p>
         </w:tc>
       </w:tr>
@@ -597,40 +492,6 @@
               <w:pStyle w:val="ListParagraph"/>
               <w:ind w:left="0"/>
             </w:pPr>
-            <w:r>
-              <w:rPr>
-                <w:sz w:val="24"/>
-                <w:szCs w:val="24"/>
-                <w:lang w:eastAsia="zh-CN"/>
-              </w:rPr>
-              <w:t>{{</w:t>
-            </w:r>
-            <w:proofErr w:type="spellStart"/>
-            <w:r>
-              <w:rPr>
-                <w:sz w:val="24"/>
-                <w:szCs w:val="24"/>
-                <w:lang w:eastAsia="zh-CN"/>
-              </w:rPr>
-              <w:t>machine</w:t>
-            </w:r>
-            <w:r>
-              <w:rPr>
-                <w:sz w:val="24"/>
-                <w:szCs w:val="24"/>
-                <w:lang w:eastAsia="zh-CN"/>
-              </w:rPr>
-              <w:t>_name</w:t>
-            </w:r>
-            <w:proofErr w:type="spellEnd"/>
-            <w:r>
-              <w:rPr>
-                <w:sz w:val="24"/>
-                <w:szCs w:val="24"/>
-                <w:lang w:eastAsia="zh-CN"/>
-              </w:rPr>
-              <w:t>}}</w:t>
-            </w:r>
           </w:p>
         </w:tc>
       </w:tr>
@@ -671,40 +532,6 @@
             <w:r>
               <w:t xml:space="preserve"> </w:t>
             </w:r>
-            <w:r>
-              <w:rPr>
-                <w:sz w:val="24"/>
-                <w:szCs w:val="24"/>
-                <w:lang w:eastAsia="zh-CN"/>
-              </w:rPr>
-              <w:t>{{</w:t>
-            </w:r>
-            <w:proofErr w:type="spellStart"/>
-            <w:r>
-              <w:rPr>
-                <w:sz w:val="24"/>
-                <w:szCs w:val="24"/>
-                <w:lang w:eastAsia="zh-CN"/>
-              </w:rPr>
-              <w:t>machine_</w:t>
-            </w:r>
-            <w:r>
-              <w:rPr>
-                <w:sz w:val="24"/>
-                <w:szCs w:val="24"/>
-                <w:lang w:eastAsia="zh-CN"/>
-              </w:rPr>
-              <w:t>dimension</w:t>
-            </w:r>
-            <w:proofErr w:type="spellEnd"/>
-            <w:r>
-              <w:rPr>
-                <w:sz w:val="24"/>
-                <w:szCs w:val="24"/>
-                <w:lang w:eastAsia="zh-CN"/>
-              </w:rPr>
-              <w:t>}}</w:t>
-            </w:r>
           </w:p>
         </w:tc>
       </w:tr>
@@ -733,57 +560,23 @@
         </w:tc>
         <w:tc>
           <w:tcPr>
-            <w:tcW w:w="2268" w:type="dxa"/>
+            <w:tcW w:w="2093" w:type="dxa"/>
+            <w:gridSpan w:val="4"/>
+          </w:tcPr>
+          <w:p>
+            <w:pPr>
+              <w:pStyle w:val="ListParagraph"/>
+              <w:ind w:left="0"/>
+            </w:pPr>
+            <w:r>
+              <w:t xml:space="preserve"> </w:t>
+            </w:r>
+          </w:p>
+        </w:tc>
+        <w:tc>
+          <w:tcPr>
+            <w:tcW w:w="1843" w:type="dxa"/>
             <w:gridSpan w:val="3"/>
-          </w:tcPr>
-          <w:p>
-            <w:pPr>
-              <w:pStyle w:val="ListParagraph"/>
-              <w:ind w:left="0"/>
-            </w:pPr>
-            <w:r>
-              <w:t xml:space="preserve"> </w:t>
-            </w:r>
-            <w:r>
-              <w:rPr>
-                <w:sz w:val="24"/>
-                <w:szCs w:val="24"/>
-                <w:lang w:eastAsia="zh-CN"/>
-              </w:rPr>
-              <w:t>{{</w:t>
-            </w:r>
-            <w:proofErr w:type="spellStart"/>
-            <w:r>
-              <w:rPr>
-                <w:sz w:val="24"/>
-                <w:szCs w:val="24"/>
-                <w:lang w:eastAsia="zh-CN"/>
-              </w:rPr>
-              <w:t>machine_</w:t>
-            </w:r>
-            <w:r>
-              <w:rPr>
-                <w:sz w:val="24"/>
-                <w:szCs w:val="24"/>
-                <w:lang w:eastAsia="zh-CN"/>
-              </w:rPr>
-              <w:t>weight</w:t>
-            </w:r>
-            <w:proofErr w:type="spellEnd"/>
-            <w:r>
-              <w:rPr>
-                <w:sz w:val="24"/>
-                <w:szCs w:val="24"/>
-                <w:lang w:eastAsia="zh-CN"/>
-              </w:rPr>
-              <w:t>}}</w:t>
-            </w:r>
-          </w:p>
-        </w:tc>
-        <w:tc>
-          <w:tcPr>
-            <w:tcW w:w="1984" w:type="dxa"/>
-            <w:gridSpan w:val="4"/>
           </w:tcPr>
           <w:p>
             <w:pPr>
@@ -815,7 +608,7 @@
         </w:tc>
         <w:tc>
           <w:tcPr>
-            <w:tcW w:w="2948" w:type="dxa"/>
+            <w:tcW w:w="3264" w:type="dxa"/>
             <w:gridSpan w:val="4"/>
           </w:tcPr>
           <w:p>
@@ -869,8 +662,8 @@
         </w:tc>
         <w:tc>
           <w:tcPr>
-            <w:tcW w:w="2268" w:type="dxa"/>
-            <w:gridSpan w:val="3"/>
+            <w:tcW w:w="2093" w:type="dxa"/>
+            <w:gridSpan w:val="4"/>
           </w:tcPr>
           <w:p>
             <w:pPr>
@@ -902,8 +695,8 @@
         </w:tc>
         <w:tc>
           <w:tcPr>
-            <w:tcW w:w="1984" w:type="dxa"/>
-            <w:gridSpan w:val="4"/>
+            <w:tcW w:w="1843" w:type="dxa"/>
+            <w:gridSpan w:val="3"/>
           </w:tcPr>
           <w:p>
             <w:pPr>
@@ -920,7 +713,7 @@
         </w:tc>
         <w:tc>
           <w:tcPr>
-            <w:tcW w:w="2948" w:type="dxa"/>
+            <w:tcW w:w="3264" w:type="dxa"/>
             <w:gridSpan w:val="4"/>
           </w:tcPr>
           <w:p>
@@ -1087,34 +880,7 @@
             <w:tcW w:w="6666" w:type="dxa"/>
             <w:gridSpan w:val="10"/>
           </w:tcPr>
-          <w:p>
-            <w:r>
-              <w:rPr>
-                <w:sz w:val="24"/>
-                <w:szCs w:val="24"/>
-                <w:lang w:eastAsia="zh-CN"/>
-              </w:rPr>
-              <w:t>{{</w:t>
-            </w:r>
-            <w:proofErr w:type="spellStart"/>
-            <w:r>
-              <w:rPr>
-                <w:sz w:val="24"/>
-                <w:szCs w:val="24"/>
-                <w:lang w:eastAsia="zh-CN"/>
-              </w:rPr>
-              <w:t>Crane_lm</w:t>
-            </w:r>
-            <w:proofErr w:type="spellEnd"/>
-            <w:r>
-              <w:rPr>
-                <w:sz w:val="24"/>
-                <w:szCs w:val="24"/>
-                <w:lang w:eastAsia="zh-CN"/>
-              </w:rPr>
-              <w:t>}}</w:t>
-            </w:r>
-          </w:p>
+          <w:p/>
         </w:tc>
       </w:tr>
       <w:tr>
@@ -1135,8 +901,8 @@
         </w:tc>
         <w:tc>
           <w:tcPr>
-            <w:tcW w:w="1875" w:type="dxa"/>
-            <w:gridSpan w:val="3"/>
+            <w:tcW w:w="1321" w:type="dxa"/>
+            <w:gridSpan w:val="2"/>
           </w:tcPr>
           <w:p>
             <w:pPr>
@@ -1144,54 +910,12 @@
                 <w:color w:val="FF0000"/>
               </w:rPr>
             </w:pPr>
-            <w:r>
-              <w:rPr>
-                <w:sz w:val="24"/>
-                <w:szCs w:val="24"/>
-                <w:lang w:eastAsia="zh-CN"/>
-              </w:rPr>
-              <w:t>{{</w:t>
-            </w:r>
-            <w:proofErr w:type="spellStart"/>
-            <w:r>
-              <w:rPr>
-                <w:sz w:val="24"/>
-                <w:szCs w:val="24"/>
-                <w:lang w:eastAsia="zh-CN"/>
-              </w:rPr>
-              <w:t>crane</w:t>
-            </w:r>
-            <w:r>
-              <w:rPr>
-                <w:sz w:val="24"/>
-                <w:szCs w:val="24"/>
-                <w:lang w:eastAsia="zh-CN"/>
-              </w:rPr>
-              <w:t>_</w:t>
-            </w:r>
-            <w:r>
-              <w:rPr>
-                <w:sz w:val="24"/>
-                <w:szCs w:val="24"/>
-                <w:lang w:eastAsia="zh-CN"/>
-              </w:rPr>
-              <w:t>renew</w:t>
-            </w:r>
-            <w:proofErr w:type="spellEnd"/>
-            <w:r>
-              <w:rPr>
-                <w:sz w:val="24"/>
-                <w:szCs w:val="24"/>
-                <w:lang w:eastAsia="zh-CN"/>
-              </w:rPr>
-              <w:t>}}</w:t>
-            </w:r>
-          </w:p>
-        </w:tc>
-        <w:tc>
-          <w:tcPr>
-            <w:tcW w:w="2432" w:type="dxa"/>
-            <w:gridSpan w:val="6"/>
+          </w:p>
+        </w:tc>
+        <w:tc>
+          <w:tcPr>
+            <w:tcW w:w="2986" w:type="dxa"/>
+            <w:gridSpan w:val="7"/>
           </w:tcPr>
           <w:p>
             <w:pPr>
@@ -1214,48 +938,6 @@
                 <w:color w:val="FF0000"/>
               </w:rPr>
             </w:pPr>
-            <w:r>
-              <w:rPr>
-                <w:sz w:val="24"/>
-                <w:szCs w:val="24"/>
-                <w:lang w:eastAsia="zh-CN"/>
-              </w:rPr>
-              <w:t>{{</w:t>
-            </w:r>
-            <w:proofErr w:type="spellStart"/>
-            <w:r>
-              <w:rPr>
-                <w:sz w:val="24"/>
-                <w:szCs w:val="24"/>
-                <w:lang w:eastAsia="zh-CN"/>
-              </w:rPr>
-              <w:t>crane</w:t>
-            </w:r>
-            <w:r>
-              <w:rPr>
-                <w:sz w:val="24"/>
-                <w:szCs w:val="24"/>
-                <w:lang w:eastAsia="zh-CN"/>
-              </w:rPr>
-              <w:t>_</w:t>
-            </w:r>
-            <w:r>
-              <w:rPr>
-                <w:sz w:val="24"/>
-                <w:szCs w:val="24"/>
-                <w:lang w:eastAsia="zh-CN"/>
-              </w:rPr>
-              <w:t>expiry</w:t>
-            </w:r>
-            <w:proofErr w:type="spellEnd"/>
-            <w:r>
-              <w:rPr>
-                <w:sz w:val="24"/>
-                <w:szCs w:val="24"/>
-                <w:lang w:eastAsia="zh-CN"/>
-              </w:rPr>
-              <w:t>}}</w:t>
-            </w:r>
           </w:p>
         </w:tc>
       </w:tr>
@@ -1289,48 +971,6 @@
               <w:pStyle w:val="ListParagraph"/>
               <w:ind w:left="0"/>
             </w:pPr>
-            <w:r>
-              <w:rPr>
-                <w:sz w:val="24"/>
-                <w:szCs w:val="24"/>
-                <w:lang w:eastAsia="zh-CN"/>
-              </w:rPr>
-              <w:t>{{</w:t>
-            </w:r>
-            <w:proofErr w:type="spellStart"/>
-            <w:r>
-              <w:rPr>
-                <w:sz w:val="24"/>
-                <w:szCs w:val="24"/>
-                <w:lang w:eastAsia="zh-CN"/>
-              </w:rPr>
-              <w:t>crane</w:t>
-            </w:r>
-            <w:r>
-              <w:rPr>
-                <w:sz w:val="24"/>
-                <w:szCs w:val="24"/>
-                <w:lang w:eastAsia="zh-CN"/>
-              </w:rPr>
-              <w:t>_</w:t>
-            </w:r>
-            <w:r>
-              <w:rPr>
-                <w:sz w:val="24"/>
-                <w:szCs w:val="24"/>
-                <w:lang w:eastAsia="zh-CN"/>
-              </w:rPr>
-              <w:t>swl</w:t>
-            </w:r>
-            <w:proofErr w:type="spellEnd"/>
-            <w:r>
-              <w:rPr>
-                <w:sz w:val="24"/>
-                <w:szCs w:val="24"/>
-                <w:lang w:eastAsia="zh-CN"/>
-              </w:rPr>
-              <w:t>}}</w:t>
-            </w:r>
           </w:p>
         </w:tc>
       </w:tr>
@@ -1392,7 +1032,7 @@
         </w:tc>
         <w:tc>
           <w:tcPr>
-            <w:tcW w:w="2017" w:type="dxa"/>
+            <w:tcW w:w="1600" w:type="dxa"/>
             <w:gridSpan w:val="4"/>
           </w:tcPr>
           <w:p>
@@ -1400,61 +1040,11 @@
               <w:pStyle w:val="ListParagraph"/>
               <w:ind w:left="0"/>
             </w:pPr>
-            <w:r>
-              <w:rPr>
-                <w:sz w:val="24"/>
-                <w:szCs w:val="24"/>
-                <w:lang w:eastAsia="zh-CN"/>
-              </w:rPr>
-              <w:t>{{</w:t>
-            </w:r>
-            <w:proofErr w:type="spellStart"/>
-            <w:r>
-              <w:rPr>
-                <w:sz w:val="24"/>
-                <w:szCs w:val="24"/>
-                <w:lang w:eastAsia="zh-CN"/>
-              </w:rPr>
-              <w:t>crane</w:t>
-            </w:r>
-            <w:r>
-              <w:rPr>
-                <w:sz w:val="24"/>
-                <w:szCs w:val="24"/>
-                <w:lang w:eastAsia="zh-CN"/>
-              </w:rPr>
-              <w:t>_</w:t>
-            </w:r>
-            <w:r>
-              <w:rPr>
-                <w:sz w:val="24"/>
-                <w:szCs w:val="24"/>
-                <w:lang w:eastAsia="zh-CN"/>
-              </w:rPr>
-              <w:t>radius</w:t>
-            </w:r>
-            <w:proofErr w:type="spellEnd"/>
-            <w:r>
-              <w:rPr>
-                <w:sz w:val="24"/>
-                <w:szCs w:val="24"/>
-                <w:lang w:eastAsia="zh-CN"/>
-              </w:rPr>
-              <w:t xml:space="preserve"> </w:t>
-            </w:r>
-            <w:r>
-              <w:rPr>
-                <w:sz w:val="24"/>
-                <w:szCs w:val="24"/>
-                <w:lang w:eastAsia="zh-CN"/>
-              </w:rPr>
-              <w:t>}}</w:t>
-            </w:r>
-          </w:p>
-        </w:tc>
-        <w:tc>
-          <w:tcPr>
-            <w:tcW w:w="1956" w:type="dxa"/>
+          </w:p>
+        </w:tc>
+        <w:tc>
+          <w:tcPr>
+            <w:tcW w:w="2373" w:type="dxa"/>
             <w:gridSpan w:val="3"/>
           </w:tcPr>
           <w:p>
@@ -1477,48 +1067,6 @@
               <w:pStyle w:val="ListParagraph"/>
               <w:ind w:left="0"/>
             </w:pPr>
-            <w:r>
-              <w:rPr>
-                <w:sz w:val="24"/>
-                <w:szCs w:val="24"/>
-                <w:lang w:eastAsia="zh-CN"/>
-              </w:rPr>
-              <w:t>{{</w:t>
-            </w:r>
-            <w:proofErr w:type="spellStart"/>
-            <w:r>
-              <w:rPr>
-                <w:sz w:val="24"/>
-                <w:szCs w:val="24"/>
-                <w:lang w:eastAsia="zh-CN"/>
-              </w:rPr>
-              <w:t>crane</w:t>
-            </w:r>
-            <w:r>
-              <w:rPr>
-                <w:sz w:val="24"/>
-                <w:szCs w:val="24"/>
-                <w:lang w:eastAsia="zh-CN"/>
-              </w:rPr>
-              <w:t>_</w:t>
-            </w:r>
-            <w:r>
-              <w:rPr>
-                <w:sz w:val="24"/>
-                <w:szCs w:val="24"/>
-                <w:lang w:eastAsia="zh-CN"/>
-              </w:rPr>
-              <w:t>swl_radius</w:t>
-            </w:r>
-            <w:proofErr w:type="spellEnd"/>
-            <w:r>
-              <w:rPr>
-                <w:sz w:val="24"/>
-                <w:szCs w:val="24"/>
-                <w:lang w:eastAsia="zh-CN"/>
-              </w:rPr>
-              <w:t>}}</w:t>
-            </w:r>
           </w:p>
         </w:tc>
       </w:tr>
@@ -1555,32 +1103,6 @@
                 <w:color w:val="FF0000"/>
               </w:rPr>
             </w:pPr>
-            <w:r>
-              <w:rPr>
-                <w:sz w:val="24"/>
-                <w:szCs w:val="24"/>
-                <w:lang w:eastAsia="zh-CN"/>
-              </w:rPr>
-              <w:t>{{</w:t>
-            </w:r>
-            <w:proofErr w:type="spellStart"/>
-            <w:r>
-              <w:rPr>
-                <w:sz w:val="24"/>
-                <w:szCs w:val="24"/>
-                <w:lang w:eastAsia="zh-CN"/>
-              </w:rPr>
-              <w:t>lifting_gear</w:t>
-            </w:r>
-            <w:proofErr w:type="spellEnd"/>
-            <w:r>
-              <w:rPr>
-                <w:sz w:val="24"/>
-                <w:szCs w:val="24"/>
-                <w:lang w:eastAsia="zh-CN"/>
-              </w:rPr>
-              <w:t>}}</w:t>
-            </w:r>
           </w:p>
         </w:tc>
       </w:tr>
@@ -1606,8 +1128,8 @@
         </w:tc>
         <w:tc>
           <w:tcPr>
-            <w:tcW w:w="1734" w:type="dxa"/>
-            <w:gridSpan w:val="2"/>
+            <w:tcW w:w="1559" w:type="dxa"/>
+            <w:gridSpan w:val="3"/>
           </w:tcPr>
           <w:p>
             <w:pPr>
@@ -1617,15 +1139,12 @@
                 <w:color w:val="FF0000"/>
               </w:rPr>
             </w:pPr>
-            <w:r>
-              <w:t>200kgs</w:t>
-            </w:r>
-          </w:p>
-        </w:tc>
-        <w:tc>
-          <w:tcPr>
-            <w:tcW w:w="2239" w:type="dxa"/>
-            <w:gridSpan w:val="5"/>
+          </w:p>
+        </w:tc>
+        <w:tc>
+          <w:tcPr>
+            <w:tcW w:w="2414" w:type="dxa"/>
+            <w:gridSpan w:val="4"/>
           </w:tcPr>
           <w:p>
             <w:pPr>
@@ -1653,32 +1172,6 @@
                 <w:color w:val="FF0000"/>
               </w:rPr>
             </w:pPr>
-            <w:r>
-              <w:rPr>
-                <w:sz w:val="24"/>
-                <w:szCs w:val="24"/>
-                <w:lang w:eastAsia="zh-CN"/>
-              </w:rPr>
-              <w:t>{{</w:t>
-            </w:r>
-            <w:proofErr w:type="spellStart"/>
-            <w:r>
-              <w:rPr>
-                <w:sz w:val="24"/>
-                <w:szCs w:val="24"/>
-                <w:lang w:eastAsia="zh-CN"/>
-              </w:rPr>
-              <w:t>total_swl_lg</w:t>
-            </w:r>
-            <w:proofErr w:type="spellEnd"/>
-            <w:r>
-              <w:rPr>
-                <w:sz w:val="24"/>
-                <w:szCs w:val="24"/>
-                <w:lang w:eastAsia="zh-CN"/>
-              </w:rPr>
-              <w:t>}}</w:t>
-            </w:r>
           </w:p>
         </w:tc>
       </w:tr>
@@ -1793,48 +1286,6 @@
                 <w:color w:val="FF0000"/>
               </w:rPr>
             </w:pPr>
-            <w:r>
-              <w:rPr>
-                <w:sz w:val="24"/>
-                <w:szCs w:val="24"/>
-                <w:lang w:eastAsia="zh-CN"/>
-              </w:rPr>
-              <w:t>{{</w:t>
-            </w:r>
-            <w:proofErr w:type="spellStart"/>
-            <w:r>
-              <w:rPr>
-                <w:sz w:val="24"/>
-                <w:szCs w:val="24"/>
-                <w:lang w:eastAsia="zh-CN"/>
-              </w:rPr>
-              <w:t>lg</w:t>
-            </w:r>
-            <w:r>
-              <w:rPr>
-                <w:sz w:val="24"/>
-                <w:szCs w:val="24"/>
-                <w:lang w:eastAsia="zh-CN"/>
-              </w:rPr>
-              <w:t>_</w:t>
-            </w:r>
-            <w:r>
-              <w:rPr>
-                <w:sz w:val="24"/>
-                <w:szCs w:val="24"/>
-                <w:lang w:eastAsia="zh-CN"/>
-              </w:rPr>
-              <w:t>expiry</w:t>
-            </w:r>
-            <w:proofErr w:type="spellEnd"/>
-            <w:r>
-              <w:rPr>
-                <w:sz w:val="24"/>
-                <w:szCs w:val="24"/>
-                <w:lang w:eastAsia="zh-CN"/>
-              </w:rPr>
-              <w:t>}}</w:t>
-            </w:r>
           </w:p>
         </w:tc>
       </w:tr>
@@ -1893,8 +1344,8 @@
         </w:trPr>
         <w:tc>
           <w:tcPr>
-            <w:tcW w:w="5275" w:type="dxa"/>
-            <w:gridSpan w:val="5"/>
+            <w:tcW w:w="5100" w:type="dxa"/>
+            <w:gridSpan w:val="6"/>
           </w:tcPr>
           <w:p>
             <w:pPr>
@@ -1908,8 +1359,8 @@
         </w:tc>
         <w:tc>
           <w:tcPr>
-            <w:tcW w:w="4932" w:type="dxa"/>
-            <w:gridSpan w:val="8"/>
+            <w:tcW w:w="5107" w:type="dxa"/>
+            <w:gridSpan w:val="7"/>
           </w:tcPr>
           <w:p>
             <w:pPr>
@@ -1920,7 +1371,7 @@
               <w:sdtPr>
                 <w:id w:val="1212308982"/>
                 <w14:checkbox>
-                  <w14:checked w14:val="1"/>
+                  <w14:checked w14:val="0"/>
                   <w14:checkedState w14:val="2612" w14:font="MS Gothic"/>
                   <w14:uncheckedState w14:val="2610" w14:font="MS Gothic"/>
                 </w14:checkbox>
@@ -1930,7 +1381,7 @@
                   <w:rPr>
                     <w:rFonts w:ascii="MS Gothic" w:eastAsia="MS Gothic" w:hAnsi="MS Gothic" w:hint="eastAsia"/>
                   </w:rPr>
-                  <w:t>☒</w:t>
+                  <w:t>☐</w:t>
                 </w:r>
               </w:sdtContent>
             </w:sdt>
@@ -1968,8 +1419,8 @@
         </w:trPr>
         <w:tc>
           <w:tcPr>
-            <w:tcW w:w="5275" w:type="dxa"/>
-            <w:gridSpan w:val="5"/>
+            <w:tcW w:w="5100" w:type="dxa"/>
+            <w:gridSpan w:val="6"/>
           </w:tcPr>
           <w:p>
             <w:pPr>
@@ -1989,8 +1440,8 @@
         </w:tc>
         <w:tc>
           <w:tcPr>
-            <w:tcW w:w="4932" w:type="dxa"/>
-            <w:gridSpan w:val="8"/>
+            <w:tcW w:w="5107" w:type="dxa"/>
+            <w:gridSpan w:val="7"/>
           </w:tcPr>
           <w:p>
             <w:pPr>
@@ -2315,19 +1766,10 @@
           </w:tcPr>
           <w:p>
             <w:r>
-              <w:lastRenderedPageBreak/>
-              <w:t xml:space="preserve"> </w:t>
-            </w:r>
-            <w:proofErr w:type="gramStart"/>
-            <w:r>
-              <w:t xml:space="preserve">Lifting  </w:t>
-            </w:r>
-            <w:r>
-              <w:t>Equipment</w:t>
-            </w:r>
-            <w:proofErr w:type="gramEnd"/>
-            <w:r>
-              <w:t xml:space="preserve"> Operator</w:t>
+              <w:t xml:space="preserve"> Lifting  </w:t>
+            </w:r>
+            <w:r>
+              <w:t>Equipment Operator</w:t>
             </w:r>
           </w:p>
         </w:tc>
@@ -2412,6 +1854,7 @@
               <w:ind w:left="360"/>
             </w:pPr>
             <w:r>
+              <w:lastRenderedPageBreak/>
               <w:t>Rigger/Signalman</w:t>
             </w:r>
           </w:p>
@@ -2638,7 +2081,7 @@
               <w:sdtPr>
                 <w:id w:val="-808168139"/>
                 <w14:checkbox>
-                  <w14:checked w14:val="1"/>
+                  <w14:checked w14:val="0"/>
                   <w14:checkedState w14:val="2612" w14:font="MS Gothic"/>
                   <w14:uncheckedState w14:val="2610" w14:font="MS Gothic"/>
                 </w14:checkbox>
@@ -2648,7 +2091,7 @@
                   <w:rPr>
                     <w:rFonts w:ascii="MS Gothic" w:eastAsia="MS Gothic" w:hAnsi="MS Gothic" w:hint="eastAsia"/>
                   </w:rPr>
-                  <w:t>☒</w:t>
+                  <w:t>☐</w:t>
                 </w:r>
               </w:sdtContent>
             </w:sdt>
@@ -2726,7 +2169,7 @@
               <w:sdtPr>
                 <w:id w:val="-755891317"/>
                 <w14:checkbox>
-                  <w14:checked w14:val="1"/>
+                  <w14:checked w14:val="0"/>
                   <w14:checkedState w14:val="2612" w14:font="MS Gothic"/>
                   <w14:uncheckedState w14:val="2610" w14:font="MS Gothic"/>
                 </w14:checkbox>
@@ -2736,7 +2179,7 @@
                   <w:rPr>
                     <w:rFonts w:ascii="MS Gothic" w:eastAsia="MS Gothic" w:hAnsi="MS Gothic" w:hint="eastAsia"/>
                   </w:rPr>
-                  <w:t>☒</w:t>
+                  <w:t>☐</w:t>
                 </w:r>
               </w:sdtContent>
             </w:sdt>
@@ -2836,7 +2279,7 @@
               <w:sdtPr>
                 <w:id w:val="-1692443375"/>
                 <w14:checkbox>
-                  <w14:checked w14:val="1"/>
+                  <w14:checked w14:val="0"/>
                   <w14:checkedState w14:val="2612" w14:font="MS Gothic"/>
                   <w14:uncheckedState w14:val="2610" w14:font="MS Gothic"/>
                 </w14:checkbox>
@@ -2846,7 +2289,7 @@
                   <w:rPr>
                     <w:rFonts w:ascii="MS Gothic" w:eastAsia="MS Gothic" w:hAnsi="MS Gothic" w:hint="eastAsia"/>
                   </w:rPr>
-                  <w:t>☒</w:t>
+                  <w:t>☐</w:t>
                 </w:r>
               </w:sdtContent>
             </w:sdt>
@@ -2922,7 +2365,7 @@
               <w:sdtPr>
                 <w:id w:val="-36591045"/>
                 <w14:checkbox>
-                  <w14:checked w14:val="1"/>
+                  <w14:checked w14:val="0"/>
                   <w14:checkedState w14:val="2612" w14:font="MS Gothic"/>
                   <w14:uncheckedState w14:val="2610" w14:font="MS Gothic"/>
                 </w14:checkbox>
@@ -2932,7 +2375,7 @@
                   <w:rPr>
                     <w:rFonts w:ascii="MS Gothic" w:eastAsia="MS Gothic" w:hAnsi="MS Gothic" w:hint="eastAsia"/>
                   </w:rPr>
-                  <w:t>☒</w:t>
+                  <w:t>☐</w:t>
                 </w:r>
               </w:sdtContent>
             </w:sdt>
@@ -2990,7 +2433,7 @@
               <w:sdtPr>
                 <w:id w:val="-497194999"/>
                 <w14:checkbox>
-                  <w14:checked w14:val="1"/>
+                  <w14:checked w14:val="0"/>
                   <w14:checkedState w14:val="2612" w14:font="MS Gothic"/>
                   <w14:uncheckedState w14:val="2610" w14:font="MS Gothic"/>
                 </w14:checkbox>
@@ -3000,7 +2443,7 @@
                   <w:rPr>
                     <w:rFonts w:ascii="MS Gothic" w:eastAsia="MS Gothic" w:hAnsi="MS Gothic" w:hint="eastAsia"/>
                   </w:rPr>
-                  <w:t>☒</w:t>
+                  <w:t>☐</w:t>
                 </w:r>
               </w:sdtContent>
             </w:sdt>
@@ -3088,7 +2531,7 @@
               <w:sdtPr>
                 <w:id w:val="-2137332394"/>
                 <w14:checkbox>
-                  <w14:checked w14:val="1"/>
+                  <w14:checked w14:val="0"/>
                   <w14:checkedState w14:val="2612" w14:font="MS Gothic"/>
                   <w14:uncheckedState w14:val="2610" w14:font="MS Gothic"/>
                 </w14:checkbox>
@@ -3098,7 +2541,7 @@
                   <w:rPr>
                     <w:rFonts w:ascii="MS Gothic" w:eastAsia="MS Gothic" w:hAnsi="MS Gothic" w:hint="eastAsia"/>
                   </w:rPr>
-                  <w:t>☒</w:t>
+                  <w:t>☐</w:t>
                 </w:r>
               </w:sdtContent>
             </w:sdt>
@@ -3839,7 +3282,7 @@
         <w:trPr>
           <w:gridAfter w:val="1"/>
           <w:wAfter w:w="3688" w:type="dxa"/>
-          <w:trHeight w:val="666"/>
+          <w:trHeight w:val="555"/>
         </w:trPr>
         <w:tc>
           <w:tcPr>
@@ -3893,6 +3336,66 @@
               <w:t xml:space="preserve">Date: </w:t>
             </w:r>
           </w:p>
+        </w:tc>
+      </w:tr>
+      <w:tr>
+        <w:trPr>
+          <w:trHeight w:val="633"/>
+        </w:trPr>
+        <w:tc>
+          <w:tcPr>
+            <w:tcW w:w="10207" w:type="dxa"/>
+            <w:gridSpan w:val="13"/>
+          </w:tcPr>
+          <w:p>
+            <w:pPr>
+              <w:pStyle w:val="ListParagraph"/>
+              <w:ind w:left="0"/>
+              <w:rPr>
+                <w:i/>
+              </w:rPr>
+            </w:pPr>
+            <w:r>
+              <w:rPr>
+                <w:i/>
+              </w:rPr>
+              <w:t>This</w:t>
+            </w:r>
+            <w:r>
+              <w:rPr>
+                <w:i/>
+              </w:rPr>
+              <w:t xml:space="preserve"> lifting plan shall be prepared by the lifting supervisor.</w:t>
+            </w:r>
+          </w:p>
+          <w:p>
+            <w:pPr>
+              <w:pStyle w:val="ListParagraph"/>
+              <w:ind w:left="0"/>
+            </w:pPr>
+            <w:r>
+              <w:rPr>
+                <w:i/>
+              </w:rPr>
+              <w:t>The Department Head responsible</w:t>
+            </w:r>
+            <w:r>
+              <w:rPr>
+                <w:i/>
+              </w:rPr>
+              <w:t xml:space="preserve"> shall approve the lifting plan / permit to work</w:t>
+            </w:r>
+          </w:p>
+        </w:tc>
+        <w:tc>
+          <w:tcPr>
+            <w:tcW w:w="3688" w:type="dxa"/>
+            <w:tcBorders>
+              <w:top w:val="nil"/>
+              <w:bottom w:val="nil"/>
+            </w:tcBorders>
+          </w:tcPr>
+          <w:p/>
         </w:tc>
       </w:tr>
     </w:tbl>

</xml_diff>